<commit_message>
docs: sharpen Data Analyst positioning
</commit_message>
<xml_diff>
--- a/portfolio/resume/Palla_Janakiram_Data_Analyst_Resume.docx
+++ b/portfolio/resume/Palla_Janakiram_Data_Analyst_Resume.docx
@@ -76,7 +76,7 @@
         <w:rPr>
           <w:sz w:val="17"/>
         </w:rPr>
-        <w:t>Data Analyst candidate with 2+ years of experience in technical operations, structured-data validation, quality checks, reporting, and issue analysis. Uses SQL, Python, Pandas, Excel, PostgreSQL, Power BI and DAX to clean data, validate KPIs, build dimensional models and create decision-focused dashboards. Portfolio work covers banking and healthcare analytics, including locally executed PySpark, Delta Lake and dbt pipelines.</w:t>
+        <w:t>Data Analyst with 2+ years of experience working with structured datasets, data validation, quality analysis, reporting and geospatial data workflows. Skilled in SQL, Python, Pandas, Excel, Power BI, PostgreSQL, data cleaning, KPI analysis, visualization and dimensional modeling. Built end-to-end banking and healthcare analytics portfolio solutions combining business analysis, data modeling, automated validation and interactive BI dashboards.</w:t>
       </w:r>
     </w:p>
     <w:p>
@@ -104,33 +104,46 @@
           <w:b/>
           <w:sz w:val="16"/>
         </w:rPr>
-        <w:t xml:space="preserve">Analytics: </w:t>
+        <w:t xml:space="preserve">Data Analytics: </w:t>
       </w:r>
       <w:r>
         <w:rPr>
           <w:sz w:val="16"/>
         </w:rPr>
-        <w:t xml:space="preserve">SQL, Python, Pandas, NumPy, Excel, data cleaning, validation, EDA, KPI reporting, business analysis  |  </w:t>
+        <w:t xml:space="preserve">SQL, Python, Pandas, NumPy, Excel, data cleaning, data validation, EDA, KPI analysis, business analysis  |  </w:t>
       </w:r>
       <w:r>
         <w:rPr>
           <w:b/>
           <w:sz w:val="16"/>
         </w:rPr>
-        <w:t xml:space="preserve">BI and databases: </w:t>
+        <w:t xml:space="preserve">Business Intelligence: </w:t>
       </w:r>
       <w:r>
         <w:rPr>
           <w:sz w:val="16"/>
         </w:rPr>
-        <w:t xml:space="preserve">Power BI, DAX, Power Query, dimensional modeling, PostgreSQL, DuckDB, data visualization  |  </w:t>
+        <w:t xml:space="preserve">Power BI, DAX, Power Query, data visualization, dimensional modeling  |  </w:t>
       </w:r>
       <w:r>
         <w:rPr>
           <w:b/>
           <w:sz w:val="16"/>
         </w:rPr>
-        <w:t xml:space="preserve">Modern analytics: </w:t>
+        <w:t xml:space="preserve">Databases: </w:t>
+      </w:r>
+      <w:r>
+        <w:rPr>
+          <w:sz w:val="16"/>
+        </w:rPr>
+        <w:t xml:space="preserve">PostgreSQL  |  </w:t>
+      </w:r>
+      <w:r>
+        <w:rPr>
+          <w:b/>
+          <w:sz w:val="16"/>
+        </w:rPr>
+        <w:t xml:space="preserve">Modern Analytics: </w:t>
       </w:r>
       <w:r>
         <w:rPr>
@@ -149,7 +162,7 @@
         <w:rPr>
           <w:sz w:val="16"/>
         </w:rPr>
-        <w:t>Git, GitHub, ArcGIS Pro, Google Earth Pro, KML/KMZ, Microsoft 365</w:t>
+        <w:t>Git, GitHub, ArcGIS Pro, Google Earth Pro, KML/KMZ</w:t>
       </w:r>
     </w:p>
     <w:p>
@@ -199,7 +212,7 @@
                 <w:b/>
                 <w:sz w:val="18"/>
               </w:rPr>
-              <w:t>Sr. Associate - Customer Support</w:t>
+              <w:t>Sr. Associate - Customer Support (Technical Support)</w:t>
             </w:r>
             <w:r>
               <w:rPr>
@@ -246,7 +259,7 @@
         <w:rPr>
           <w:sz w:val="17"/>
         </w:rPr>
-        <w:t>Validate structured mapping and operational records against defined business rules, document discrepancies, and maintain accurate service records within SLA timelines.</w:t>
+        <w:t>Analyze and validate structured geospatial and map data against defined mapping specifications and business rules, identifying inconsistencies and maintaining data accuracy.</w:t>
       </w:r>
     </w:p>
     <w:p>
@@ -259,7 +272,20 @@
         <w:rPr>
           <w:sz w:val="17"/>
         </w:rPr>
-        <w:t>Investigate recurring data and service issues, coordinate escalations, and communicate resolution status clearly to internal stakeholders.</w:t>
+        <w:t>Perform quality checks across road-network features, including lanes, intersections, crosswalks, bike lanes and parking areas, to ensure completeness and consistency.</w:t>
+      </w:r>
+    </w:p>
+    <w:p>
+      <w:pPr>
+        <w:pStyle w:val="ListBullet"/>
+        <w:spacing w:after="14" w:line="240" w:lineRule="auto"/>
+        <w:ind w:left="230" w:hanging="173"/>
+      </w:pPr>
+      <w:r>
+        <w:rPr>
+          <w:sz w:val="17"/>
+        </w:rPr>
+        <w:t>Investigate data discrepancies and edge cases, document findings, and coordinate corrections through established quality workflows.</w:t>
       </w:r>
     </w:p>
     <w:tbl>
@@ -340,7 +366,7 @@
         <w:rPr>
           <w:sz w:val="17"/>
         </w:rPr>
-        <w:t>Performed data extraction, validation and quality checks for road-infrastructure, mapping and asset-analysis workflows using Excel, GIS tools and structured datasets.</w:t>
+        <w:t>Extracted, cleaned, validated and analyzed structured roadway and infrastructure datasets using Excel, Python and GIS tools, identifying missing, duplicate and inconsistent records.</w:t>
       </w:r>
     </w:p>
     <w:p>
@@ -353,7 +379,7 @@
         <w:rPr>
           <w:sz w:val="17"/>
         </w:rPr>
-        <w:t>Reconciled asset attributes, GPS/KML information and source imagery; identified missing, duplicate and inconsistent records for correction and reporting.</w:t>
+        <w:t>Processed and reconciled GPS/KML data, spatial attributes and source imagery to maintain accurate asset-level datasets and analytical deliverables.</w:t>
       </w:r>
     </w:p>
     <w:p>
@@ -366,7 +392,7 @@
         <w:rPr>
           <w:sz w:val="17"/>
         </w:rPr>
-        <w:t>Maintained analytical deliverables, issue records and SOPs while coordinating with technical, GIS and operations teams to resolve data-quality problems.</w:t>
+        <w:t>Prepared structured Excel/CSV and geospatial outputs for downstream analysis and reporting while coordinating resolution of data-quality issues.</w:t>
       </w:r>
     </w:p>
     <w:p>
@@ -463,7 +489,7 @@
         <w:rPr>
           <w:sz w:val="17"/>
         </w:rPr>
-        <w:t>Built a six-page Power BI banking dashboard covering executive performance, deposits, transactions, credit risk, fraud, customers and branches; validated 108 report elements and ten headline KPIs.</w:t>
+        <w:t>Analyzed 5,000 customers and 120,000 transactions across deposits, lending, fraud, credit risk, collections and churn using SQL, Python and reconciled KPI logic.</w:t>
       </w:r>
     </w:p>
     <w:p>
@@ -476,7 +502,7 @@
         <w:rPr>
           <w:sz w:val="17"/>
         </w:rPr>
-        <w:t>Implemented a local Bronze-Silver-Gold lakehouse across 257,969 records using PySpark and Delta Lake, with checksum-based incremental ingestion and partitioned transaction processing.</w:t>
+        <w:t>Built a six-page Power BI dashboard with a dimensional model, DAX measures and decision-focused reporting; validated 108 report elements and ten headline KPIs.</w:t>
       </w:r>
     </w:p>
     <w:p>
@@ -489,7 +515,7 @@
         <w:rPr>
           <w:sz w:val="17"/>
         </w:rPr>
-        <w:t>Built 11 dbt models with 12 passing tests, DuckDB serving tables, quality gates, monitoring and an eight-task Airflow DAG design; 8 automated repository tests passed.</w:t>
+        <w:t>Implemented a local Bronze-Silver-Gold pipeline using PySpark and Delta Lake, with 11 dbt models, 12 passing dbt tests, automated quality checks and an eight-task Airflow DAG design.</w:t>
       </w:r>
     </w:p>
     <w:p>
@@ -603,7 +629,20 @@
         <w:rPr>
           <w:sz w:val="17"/>
         </w:rPr>
-        <w:t>Built validated Power BI and Plotly Dash reporting for revenue, collections, patient flow, no-shows, satisfaction, wait times and readmission monitoring.</w:t>
+        <w:t>Validated healthcare KPIs for revenue, collections, patient flow, no-shows, wait times, satisfaction and readmissions, translating results into business insights.</w:t>
+      </w:r>
+    </w:p>
+    <w:p>
+      <w:pPr>
+        <w:pStyle w:val="ListBullet"/>
+        <w:spacing w:after="14" w:line="240" w:lineRule="auto"/>
+        <w:ind w:left="230" w:hanging="173"/>
+      </w:pPr>
+      <w:r>
+        <w:rPr>
+          <w:sz w:val="17"/>
+        </w:rPr>
+        <w:t>Built interactive Power BI and Plotly Dash reporting for operational and financial performance analysis.</w:t>
       </w:r>
     </w:p>
     <w:p>

</xml_diff>

<commit_message>
docs: align portfolio with Data Analyst positioning
</commit_message>
<xml_diff>
--- a/portfolio/resume/Palla_Janakiram_Data_Analyst_Resume.docx
+++ b/portfolio/resume/Palla_Janakiram_Data_Analyst_Resume.docx
@@ -76,7 +76,7 @@
         <w:rPr>
           <w:sz w:val="17"/>
         </w:rPr>
-        <w:t>Data Analyst with 2+ years of experience working with structured datasets, data validation, quality analysis, reporting and geospatial data workflows. Skilled in SQL, Python, Pandas, Excel, Power BI, PostgreSQL, data cleaning, KPI analysis, visualization and dimensional modeling. Built end-to-end banking and healthcare analytics portfolio solutions combining business analysis, data modeling, automated validation and interactive BI dashboards.</w:t>
+        <w:t>Data Analyst with 2+ years of experience cleaning, transforming, validating and analyzing structured operational and geospatial datasets. Skilled in SQL, Python, Pandas, Excel, Power BI and PostgreSQL, with strengths in dashboard development, KPI analysis, dimensional modeling and business insights. Built banking and healthcare analytics solutions with additional exposure to PySpark, Delta Lake, dbt and Airflow workflows.</w:t>
       </w:r>
     </w:p>
     <w:p>
@@ -110,7 +110,7 @@
         <w:rPr>
           <w:sz w:val="16"/>
         </w:rPr>
-        <w:t xml:space="preserve">SQL, Python, Pandas, NumPy, Excel, data cleaning, data validation, EDA, KPI analysis, business analysis  |  </w:t>
+        <w:t xml:space="preserve">SQL, Python, Pandas, NumPy, Excel, data cleaning, transformation, validation, EDA, KPI analysis, business analysis  |  </w:t>
       </w:r>
       <w:r>
         <w:rPr>
@@ -123,7 +123,7 @@
         <w:rPr>
           <w:sz w:val="16"/>
         </w:rPr>
-        <w:t xml:space="preserve">Power BI, DAX, Power Query, data visualization, dimensional modeling  |  </w:t>
+        <w:t xml:space="preserve">Power BI, DAX, Power Query, data visualization, dashboard development, dimensional modeling  |  </w:t>
       </w:r>
       <w:r>
         <w:rPr>
@@ -156,7 +156,7 @@
           <w:b/>
           <w:sz w:val="16"/>
         </w:rPr>
-        <w:t xml:space="preserve">Tools: </w:t>
+        <w:t xml:space="preserve">Tools / Geospatial: </w:t>
       </w:r>
       <w:r>
         <w:rPr>
@@ -212,7 +212,7 @@
                 <w:b/>
                 <w:sz w:val="18"/>
               </w:rPr>
-              <w:t>Sr. Associate - Customer Support (Technical Support)</w:t>
+              <w:t>Senior Associate</w:t>
             </w:r>
             <w:r>
               <w:rPr>
@@ -259,7 +259,7 @@
         <w:rPr>
           <w:sz w:val="17"/>
         </w:rPr>
-        <w:t>Analyze and validate structured geospatial and map data against defined mapping specifications and business rules, identifying inconsistencies and maintaining data accuracy.</w:t>
+        <w:t>Analyze and validate structured geospatial datasets against defined mapping specifications and business rules, identifying inconsistencies and maintaining data accuracy.</w:t>
       </w:r>
     </w:p>
     <w:p>
@@ -272,7 +272,7 @@
         <w:rPr>
           <w:sz w:val="17"/>
         </w:rPr>
-        <w:t>Perform quality checks across road-network features, including lanes, intersections, crosswalks, bike lanes and parking areas, to ensure completeness and consistency.</w:t>
+        <w:t>Perform quality and consistency checks across road-network features including lanes, crosswalks, intersections, bike lanes, parking areas and related mapped attributes.</w:t>
       </w:r>
     </w:p>
     <w:p>
@@ -285,7 +285,7 @@
         <w:rPr>
           <w:sz w:val="17"/>
         </w:rPr>
-        <w:t>Investigate data discrepancies and edge cases, document findings, and coordinate corrections through established quality workflows.</w:t>
+        <w:t>Investigate data discrepancies and edge cases, document findings and support correction workflows to maintain reliable mapping datasets.</w:t>
       </w:r>
     </w:p>
     <w:tbl>
@@ -319,7 +319,7 @@
                 <w:b/>
                 <w:sz w:val="18"/>
               </w:rPr>
-              <w:t>Technical Support Engineer</w:t>
+              <w:t>Analyst</w:t>
             </w:r>
             <w:r>
               <w:rPr>
@@ -366,7 +366,7 @@
         <w:rPr>
           <w:sz w:val="17"/>
         </w:rPr>
-        <w:t>Extracted, cleaned, validated and analyzed structured roadway and infrastructure datasets using Excel, Python and GIS tools, identifying missing, duplicate and inconsistent records.</w:t>
+        <w:t>Extracted, cleaned, transformed and validated structured roadway and geospatial datasets using Python, Pandas, Excel and GIS tools, producing analysis-ready outputs.</w:t>
       </w:r>
     </w:p>
     <w:p>
@@ -379,7 +379,7 @@
         <w:rPr>
           <w:sz w:val="17"/>
         </w:rPr>
-        <w:t>Processed and reconciled GPS/KML data, spatial attributes and source imagery to maintain accurate asset-level datasets and analytical deliverables.</w:t>
+        <w:t>Performed data-quality audits and reconciliation across asset attributes, GPS/KML records and source imagery to identify missing, duplicate and inconsistent records.</w:t>
       </w:r>
     </w:p>
     <w:p>
@@ -392,7 +392,7 @@
         <w:rPr>
           <w:sz w:val="17"/>
         </w:rPr>
-        <w:t>Prepared structured Excel/CSV and geospatial outputs for downstream analysis and reporting while coordinating resolution of data-quality issues.</w:t>
+        <w:t>Prepared validated analytical datasets and reporting deliverables while applying defined business rules and quality standards across infrastructure-data workflows.</w:t>
       </w:r>
     </w:p>
     <w:p>
@@ -489,7 +489,7 @@
         <w:rPr>
           <w:sz w:val="17"/>
         </w:rPr>
-        <w:t>Analyzed 5,000 customers and 120,000 transactions across deposits, lending, fraud, credit risk, collections and churn using SQL, Python and reconciled KPI logic.</w:t>
+        <w:t>Analyzed 5,000 customers and 120,000 transactions across deposits, lending, fraud, credit risk, collections and churn using SQL, Python and validated KPI logic.</w:t>
       </w:r>
     </w:p>
     <w:p>
@@ -502,7 +502,7 @@
         <w:rPr>
           <w:sz w:val="17"/>
         </w:rPr>
-        <w:t>Built a six-page Power BI dashboard with a dimensional model, DAX measures and decision-focused reporting; validated 108 report elements and ten headline KPIs.</w:t>
+        <w:t>Built a six-page interactive Power BI dashboard with a dimensional model, DAX measures and decision-focused reporting; validated 108 report elements and ten headline KPIs.</w:t>
       </w:r>
     </w:p>
     <w:p>
@@ -515,7 +515,7 @@
         <w:rPr>
           <w:sz w:val="17"/>
         </w:rPr>
-        <w:t>Implemented a local Bronze-Silver-Gold pipeline using PySpark and Delta Lake, with 11 dbt models, 12 passing dbt tests, automated quality checks and an eight-task Airflow DAG design.</w:t>
+        <w:t>Implemented a local Bronze-Silver-Gold pipeline using PySpark and Delta Lake, with 11 dbt models, 12 passing dbt tests, automated data-quality checks and an eight-task Airflow DAG design.</w:t>
       </w:r>
     </w:p>
     <w:p>
@@ -629,7 +629,7 @@
         <w:rPr>
           <w:sz w:val="17"/>
         </w:rPr>
-        <w:t>Validated healthcare KPIs for revenue, collections, patient flow, no-shows, wait times, satisfaction and readmissions, translating results into business insights.</w:t>
+        <w:t>Validated data quality and healthcare KPIs covering revenue, collections, patient flow, no-shows, wait times, satisfaction and readmissions to identify business insights.</w:t>
       </w:r>
     </w:p>
     <w:p>
@@ -678,7 +678,7 @@
           <w:color w:val="0B3A53"/>
           <w:sz w:val="19"/>
         </w:rPr>
-        <w:t>EDUCATION AND CERTIFICATIONS</w:t>
+        <w:t>EDUCATION</w:t>
       </w:r>
     </w:p>
     <w:p>
@@ -696,20 +696,7 @@
         <w:rPr>
           <w:sz w:val="17"/>
         </w:rPr>
-        <w:t xml:space="preserve"> | WISTM, Andhra University | 2020 - 2023 | 72%</w:t>
-        <w:br/>
-      </w:r>
-      <w:r>
-        <w:rPr>
-          <w:b/>
-        </w:rPr>
-        <w:t xml:space="preserve">Certifications: </w:t>
-      </w:r>
-      <w:r>
-        <w:rPr>
-          <w:sz w:val="17"/>
-        </w:rPr>
-        <w:t>SQL for Data Analytics | Python for Data Analysis | Microsoft Power BI | Microsoft Excel for Data Analysis</w:t>
+        <w:t xml:space="preserve"> | WISTM, Andhra University | Completed 2023 | GPA: 7.19/10</w:t>
       </w:r>
     </w:p>
     <w:sectPr>

</xml_diff>

<commit_message>
docs: strengthen modern Data Analyst profile
</commit_message>
<xml_diff>
--- a/portfolio/resume/Palla_Janakiram_Data_Analyst_Resume.docx
+++ b/portfolio/resume/Palla_Janakiram_Data_Analyst_Resume.docx
@@ -29,6 +29,20 @@
           <w:sz w:val="20"/>
         </w:rPr>
         <w:t>DATA ANALYST</w:t>
+      </w:r>
+    </w:p>
+    <w:p>
+      <w:pPr>
+        <w:spacing w:after="20"/>
+        <w:jc w:val="center"/>
+      </w:pPr>
+      <w:r>
+        <w:rPr>
+          <w:b/>
+          <w:color w:val="0B3A53"/>
+          <w:sz w:val="17"/>
+        </w:rPr>
+        <w:t>SQL  |  PYTHON  |  EXCEL  |  POWER BI</w:t>
       </w:r>
     </w:p>
     <w:p>
@@ -76,7 +90,7 @@
         <w:rPr>
           <w:sz w:val="17"/>
         </w:rPr>
-        <w:t>Data Analyst with 2+ years of experience cleaning, transforming, validating and analyzing structured operational and geospatial datasets. Skilled in SQL, Python, Pandas, Excel, Power BI and PostgreSQL, with strengths in dashboard development, KPI analysis, dimensional modeling and business insights. Built banking and healthcare analytics solutions with additional exposure to PySpark, Delta Lake, dbt and Airflow workflows.</w:t>
+        <w:t>Data Analyst with 2+ years of experience extracting, cleaning, transforming, validating and analyzing structured operational datasets. Uses SQL, Python/Pandas, Excel, PostgreSQL, Power BI and DAX to develop KPIs, dimensional models, dashboards and business insights across banking and healthcare. Applies modern analytics and Generative AI-assisted workflows to accelerate development while independently validating final logic and outputs.</w:t>
       </w:r>
     </w:p>
     <w:p>
@@ -110,7 +124,7 @@
         <w:rPr>
           <w:sz w:val="16"/>
         </w:rPr>
-        <w:t xml:space="preserve">SQL, Python, Pandas, NumPy, Excel, data cleaning, transformation, validation, EDA, KPI analysis, business analysis  |  </w:t>
+        <w:t xml:space="preserve">SQL, Python, Pandas, NumPy, Excel, data cleaning, transformation, validation, EDA, statistical analysis, KPI analysis, business analysis  |  </w:t>
       </w:r>
       <w:r>
         <w:rPr>
@@ -123,14 +137,14 @@
         <w:rPr>
           <w:sz w:val="16"/>
         </w:rPr>
-        <w:t xml:space="preserve">Power BI, DAX, Power Query, data visualization, dashboard development, dimensional modeling  |  </w:t>
+        <w:t xml:space="preserve">Power BI, DAX, Power Query, data visualization, dashboard development, dimensional modeling, data storytelling  |  </w:t>
       </w:r>
       <w:r>
         <w:rPr>
           <w:b/>
           <w:sz w:val="16"/>
         </w:rPr>
-        <w:t xml:space="preserve">Databases: </w:t>
+        <w:t xml:space="preserve">Database: </w:t>
       </w:r>
       <w:r>
         <w:rPr>
@@ -149,20 +163,33 @@
         <w:rPr>
           <w:sz w:val="16"/>
         </w:rPr>
-        <w:t xml:space="preserve">PySpark, Apache Spark, Delta Lake, dbt, medallion architecture, Airflow DAG design  |  </w:t>
+        <w:t xml:space="preserve">PySpark, Apache Spark, Delta Lake, dbt, medallion architecture, Airflow DAG design, incremental processing, automated data quality  |  </w:t>
       </w:r>
       <w:r>
         <w:rPr>
           <w:b/>
           <w:sz w:val="16"/>
         </w:rPr>
-        <w:t xml:space="preserve">Tools / Geospatial: </w:t>
+        <w:t xml:space="preserve">AI-Assisted Analytics: </w:t>
       </w:r>
       <w:r>
         <w:rPr>
           <w:sz w:val="16"/>
         </w:rPr>
-        <w:t>Git, GitHub, ArcGIS Pro, Google Earth Pro, KML/KMZ</w:t>
+        <w:t xml:space="preserve">ChatGPT, Microsoft Copilot, SQL/Python and formula troubleshooting, workflow optimization, documentation  |  </w:t>
+      </w:r>
+      <w:r>
+        <w:rPr>
+          <w:b/>
+          <w:sz w:val="16"/>
+        </w:rPr>
+        <w:t xml:space="preserve">Tools: </w:t>
+      </w:r>
+      <w:r>
+        <w:rPr>
+          <w:sz w:val="16"/>
+        </w:rPr>
+        <w:t>Git, GitHub, ArcGIS Pro, Google Earth Pro</w:t>
       </w:r>
     </w:p>
     <w:p>
@@ -259,7 +286,7 @@
         <w:rPr>
           <w:sz w:val="17"/>
         </w:rPr>
-        <w:t>Analyze and validate structured geospatial datasets against defined mapping specifications and business rules, identifying inconsistencies and maintaining data accuracy.</w:t>
+        <w:t>Analyze and validate high-volume structured operational and location-based datasets against defined specifications and business rules, identifying inconsistencies and maintaining accuracy.</w:t>
       </w:r>
     </w:p>
     <w:p>
@@ -272,7 +299,7 @@
         <w:rPr>
           <w:sz w:val="17"/>
         </w:rPr>
-        <w:t>Perform quality and consistency checks across road-network features including lanes, crosswalks, intersections, bike lanes, parking areas and related mapped attributes.</w:t>
+        <w:t>Execute quality controls and consistency checks across complex data attributes to detect exceptions, incomplete records and conflicting values.</w:t>
       </w:r>
     </w:p>
     <w:p>
@@ -285,7 +312,7 @@
         <w:rPr>
           <w:sz w:val="17"/>
         </w:rPr>
-        <w:t>Investigate data discrepancies and edge cases, document findings and support correction workflows to maintain reliable mapping datasets.</w:t>
+        <w:t>Investigate edge cases and root causes, document findings and coordinate correction workflows to maintain reliable analytical datasets.</w:t>
       </w:r>
     </w:p>
     <w:tbl>
@@ -366,7 +393,7 @@
         <w:rPr>
           <w:sz w:val="17"/>
         </w:rPr>
-        <w:t>Extracted, cleaned, transformed and validated structured roadway and geospatial datasets using Python, Pandas, Excel and GIS tools, producing analysis-ready outputs.</w:t>
+        <w:t>Extracted, cleaned, transformed and validated multi-source structured datasets using Python, Pandas, Excel and GIS tools, producing analysis-ready outputs.</w:t>
       </w:r>
     </w:p>
     <w:p>
@@ -379,7 +406,7 @@
         <w:rPr>
           <w:sz w:val="17"/>
         </w:rPr>
-        <w:t>Performed data-quality audits and reconciliation across asset attributes, GPS/KML records and source imagery to identify missing, duplicate and inconsistent records.</w:t>
+        <w:t>Profiled and reconciled asset attributes, GPS/KML records and source imagery to identify missing, duplicate, anomalous and inconsistent records.</w:t>
       </w:r>
     </w:p>
     <w:p>
@@ -392,7 +419,7 @@
         <w:rPr>
           <w:sz w:val="17"/>
         </w:rPr>
-        <w:t>Prepared validated analytical datasets and reporting deliverables while applying defined business rules and quality standards across infrastructure-data workflows.</w:t>
+        <w:t>Applied business-rule validation and quality audits, prepared analytical datasets and structured reports, and coordinated resolution of recurring data exceptions.</w:t>
       </w:r>
     </w:p>
     <w:p>
@@ -448,7 +475,7 @@
               <w:rPr>
                 <w:sz w:val="18"/>
               </w:rPr>
-              <w:t xml:space="preserve"> | Portfolio Project</w:t>
+              <w:t xml:space="preserve"> | End-to-End Banking Analytics &amp; Modern BI Platform</w:t>
             </w:r>
           </w:p>
         </w:tc>
@@ -489,7 +516,7 @@
         <w:rPr>
           <w:sz w:val="17"/>
         </w:rPr>
-        <w:t>Analyzed 5,000 customers and 120,000 transactions across deposits, lending, fraud, credit risk, collections and churn using SQL, Python and validated KPI logic.</w:t>
+        <w:t>Unified customer, transaction, deposit, lending, fraud, collection, churn and branch data to support management analysis of behavior, trends, portfolio risk and operating performance.</w:t>
       </w:r>
     </w:p>
     <w:p>
@@ -502,7 +529,7 @@
         <w:rPr>
           <w:sz w:val="17"/>
         </w:rPr>
-        <w:t>Built a six-page interactive Power BI dashboard with a dimensional model, DAX measures and decision-focused reporting; validated 108 report elements and ten headline KPIs.</w:t>
+        <w:t>Cleaned, joined, transformed and validated 257,969 records; used SQL and Python/Pandas to calculate and reconcile KPIs across 5,000 customers and 120,000 transactions.</w:t>
       </w:r>
     </w:p>
     <w:p>
@@ -515,7 +542,20 @@
         <w:rPr>
           <w:sz w:val="17"/>
         </w:rPr>
-        <w:t>Implemented a local Bronze-Silver-Gold pipeline using PySpark and Delta Lake, with 11 dbt models, 12 passing dbt tests, automated data-quality checks and an eight-task Airflow DAG design.</w:t>
+        <w:t>Built a six-page interactive Power BI solution using Power Query, dimensional modeling, DAX measures, synchronized filters and decision-focused trend and drill-down analysis.</w:t>
+      </w:r>
+    </w:p>
+    <w:p>
+      <w:pPr>
+        <w:pStyle w:val="ListBullet"/>
+        <w:spacing w:after="14" w:line="240" w:lineRule="auto"/>
+        <w:ind w:left="230" w:hanging="173"/>
+      </w:pPr>
+      <w:r>
+        <w:rPr>
+          <w:sz w:val="17"/>
+        </w:rPr>
+        <w:t>Implemented a local PySpark/Delta Lake Bronze-Silver-Gold pipeline with incremental processing, 11 dbt models, 12 passing dbt tests, 8 repository tests and an eight-task Airflow DAG design.</w:t>
       </w:r>
     </w:p>
     <w:p>
@@ -575,7 +615,7 @@
               <w:rPr>
                 <w:sz w:val="18"/>
               </w:rPr>
-              <w:t xml:space="preserve"> | Portfolio Project</w:t>
+              <w:t xml:space="preserve"> | Healthcare Revenue, Patient Flow &amp; Operational Intelligence</w:t>
             </w:r>
           </w:p>
         </w:tc>
@@ -616,7 +656,7 @@
         <w:rPr>
           <w:sz w:val="17"/>
         </w:rPr>
-        <w:t>Analyzed synthetic multi-hospital operations covering 500,000 appointments and 300,000 encounters using PostgreSQL, SQL, Python and Pandas.</w:t>
+        <w:t>Integrated and analyzed 500,000 appointments and 300,000 encounters using PostgreSQL, SQL and Python/Pandas to create a centralized view of patient flow and hospital performance.</w:t>
       </w:r>
     </w:p>
     <w:p>
@@ -629,7 +669,7 @@
         <w:rPr>
           <w:sz w:val="17"/>
         </w:rPr>
-        <w:t>Validated data quality and healthcare KPIs covering revenue, collections, patient flow, no-shows, wait times, satisfaction and readmissions to identify business insights.</w:t>
+        <w:t>Cleaned and validated healthcare data, performed EDA and calculated KPIs including 9.81% no-shows, 62.86% collections, 62.18-minute waits, 74.61 satisfaction and 3.65% readmissions.</w:t>
       </w:r>
     </w:p>
     <w:p>
@@ -642,7 +682,7 @@
         <w:rPr>
           <w:sz w:val="17"/>
         </w:rPr>
-        <w:t>Built interactive Power BI and Plotly Dash reporting for operational and financial performance analysis.</w:t>
+        <w:t>Built Power BI and Plotly Dash reporting for revenue and collections (₹178.13 Cr billed; ₹111.98 Cr collected), no-shows, patient experience, wait times and readmission risk.</w:t>
       </w:r>
     </w:p>
     <w:p>

</xml_diff>